<commit_message>
fix(onboarding): letter-of-offer acceptance step renders flush left in the preview
The paragraph was styled as a numbered-list item with numbering switched
off (numId 0). Word drops the list indent in that case; docx-preview keeps
it, so the preview showed an indent the letter never had. Both such
paragraphs are now plain OPALBody, pinned by a template test.

Co-Authored-By: Claude Fable 5.1 <noreply@anthropic.com>
</commit_message>
<xml_diff>
--- a/backend/onboarding-templates/letter-of-offer-v1.docx
+++ b/backend/onboarding-templates/letter-of-offer-v1.docx
@@ -1576,11 +1576,7 @@
     </w:p>
     <w:p>
       <w:pPr>
-        <w:pStyle w:val="OPALNumberedList2"/>
-        <w:numPr>
-          <w:ilvl w:val="0"/>
-          <w:numId w:val="0"/>
-        </w:numPr>
+        <w:pStyle w:val="OPALBody"/>
         <w:jc w:val="both"/>
         <w:rPr>
           <w:sz w:val="21"/>
@@ -2168,11 +2164,7 @@
     </w:p>
     <w:p>
       <w:pPr>
-        <w:pStyle w:val="OPALNumberedList2"/>
-        <w:numPr>
-          <w:ilvl w:val="0"/>
-          <w:numId w:val="0"/>
-        </w:numPr>
+        <w:pStyle w:val="OPALBody"/>
       </w:pPr>
     </w:p>
     <w:tbl>

</xml_diff>

<commit_message>
fix(onboarding): letter of offer wording — 'I am not subject…', plain business-day and twelve-month periods
Acceptance point 4 now reads as its own statement after the lead-in, and
point 3 carries the joining 'and'. The bracketed drafting placeholders
'[two (2) business days]' and '[12] months' become 'two (2) business
days' and 'twelve (12) months'.

Co-Authored-By: Claude Fable 5.1 <noreply@anthropic.com>
</commit_message>
<xml_diff>
--- a/backend/onboarding-templates/letter-of-offer-v1.docx
+++ b/backend/onboarding-templates/letter-of-offer-v1.docx
@@ -1318,7 +1318,7 @@
         <w:t>National Police Check</w:t>
       </w:r>
       <w:r>
-        <w:t xml:space="preserve"> — a satisfactory check issued within the preceding [12] months.</w:t>
+        <w:t xml:space="preserve"> — a satisfactory check issued within the preceding twelve (12) months.</w:t>
       </w:r>
     </w:p>
     <w:p>
@@ -1732,7 +1732,7 @@
         <w:jc w:val="both"/>
       </w:pPr>
       <w:r>
-        <w:t>Upon receipt of your acceptance, the Company will provide you with your Contract of Employment, the position description for Your Role, the Company's employee policies and procedures, and the Fair Work Information Statement, within [two (2) business days].</w:t>
+        <w:t>Upon receipt of your acceptance, the Company will provide you with your Contract of Employment, the position description for Your Role, the Company's employee policies and procedures, and the Fair Work Information Statement, within two (2) business days.</w:t>
       </w:r>
     </w:p>
     <w:p>
@@ -2124,7 +2124,7 @@
           <w:sz w:val="21"/>
           <w:szCs w:val="21"/>
         </w:rPr>
-        <w:t xml:space="preserve">The information provided by me during the recruitment process is true, accurate and complete in all material respects; </w:t>
+        <w:t xml:space="preserve">The information provided by me during the recruitment process is true, accurate and complete in all material respects; and</w:t>
       </w:r>
     </w:p>
     <w:p>
@@ -2145,7 +2145,7 @@
           <w:sz w:val="21"/>
           <w:szCs w:val="21"/>
         </w:rPr>
-        <w:t>and</w:t>
+        <w:t>I</w:t>
       </w:r>
       <w:r>
         <w:rPr>

</xml_diff>